<commit_message>
Added pragmas to top.cpp
</commit_message>
<xml_diff>
--- a/2026_Spring/lab4/Reports/report.docx
+++ b/2026_Spring/lab4/Reports/report.docx
@@ -29,10 +29,10 @@
     <w:p>
       <w:r>
         <w:drawing>
-          <wp:inline distT="0" distB="0" distL="0" distR="0" wp14:anchorId="65D8AFE9" wp14:editId="0615A6BF">
-            <wp:extent cx="4119810" cy="2514600"/>
+          <wp:inline distT="0" distB="0" distL="0" distR="0" wp14:anchorId="446A6F92" wp14:editId="215F8182">
+            <wp:extent cx="4314010" cy="2581275"/>
             <wp:effectExtent l="0" t="0" r="0" b="0"/>
-            <wp:docPr id="351468538" name="Picture 1"/>
+            <wp:docPr id="1599268505" name="Picture 1"/>
             <wp:cNvGraphicFramePr>
               <a:graphicFrameLocks xmlns:a="http://schemas.openxmlformats.org/drawingml/2006/main" noChangeAspect="1"/>
             </wp:cNvGraphicFramePr>
@@ -40,7 +40,7 @@
               <a:graphicData uri="http://schemas.openxmlformats.org/drawingml/2006/picture">
                 <pic:pic xmlns:pic="http://schemas.openxmlformats.org/drawingml/2006/picture">
                   <pic:nvPicPr>
-                    <pic:cNvPr id="351468538" name=""/>
+                    <pic:cNvPr id="1599268505" name=""/>
                     <pic:cNvPicPr/>
                   </pic:nvPicPr>
                   <pic:blipFill>
@@ -52,7 +52,7 @@
                   <pic:spPr>
                     <a:xfrm>
                       <a:off x="0" y="0"/>
-                      <a:ext cx="4125824" cy="2518271"/>
+                      <a:ext cx="4320105" cy="2584922"/>
                     </a:xfrm>
                     <a:prstGeom prst="rect">
                       <a:avLst/>
@@ -73,10 +73,10 @@
     <w:p>
       <w:r>
         <w:drawing>
-          <wp:inline distT="0" distB="0" distL="0" distR="0" wp14:anchorId="49A55303" wp14:editId="26CC68FA">
-            <wp:extent cx="5943600" cy="825500"/>
+          <wp:inline distT="0" distB="0" distL="0" distR="0" wp14:anchorId="328D8A82" wp14:editId="58B69DCF">
+            <wp:extent cx="6503635" cy="914400"/>
             <wp:effectExtent l="0" t="0" r="0" b="0"/>
-            <wp:docPr id="1158739946" name="Picture 1"/>
+            <wp:docPr id="827461937" name="Picture 1"/>
             <wp:cNvGraphicFramePr>
               <a:graphicFrameLocks xmlns:a="http://schemas.openxmlformats.org/drawingml/2006/main" noChangeAspect="1"/>
             </wp:cNvGraphicFramePr>
@@ -84,7 +84,7 @@
               <a:graphicData uri="http://schemas.openxmlformats.org/drawingml/2006/picture">
                 <pic:pic xmlns:pic="http://schemas.openxmlformats.org/drawingml/2006/picture">
                   <pic:nvPicPr>
-                    <pic:cNvPr id="1158739946" name=""/>
+                    <pic:cNvPr id="827461937" name=""/>
                     <pic:cNvPicPr/>
                   </pic:nvPicPr>
                   <pic:blipFill>
@@ -96,7 +96,7 @@
                   <pic:spPr>
                     <a:xfrm>
                       <a:off x="0" y="0"/>
-                      <a:ext cx="5943600" cy="825500"/>
+                      <a:ext cx="6507575" cy="914954"/>
                     </a:xfrm>
                     <a:prstGeom prst="rect">
                       <a:avLst/>
@@ -117,10 +117,10 @@
     <w:p>
       <w:r>
         <w:drawing>
-          <wp:inline distT="0" distB="0" distL="0" distR="0" wp14:anchorId="35FB6447" wp14:editId="68D2174C">
-            <wp:extent cx="3042024" cy="2752725"/>
-            <wp:effectExtent l="0" t="0" r="6350" b="0"/>
-            <wp:docPr id="1487472948" name="Picture 1"/>
+          <wp:inline distT="0" distB="0" distL="0" distR="0" wp14:anchorId="69B49199" wp14:editId="1A18E9D9">
+            <wp:extent cx="2971800" cy="2776512"/>
+            <wp:effectExtent l="0" t="0" r="0" b="5080"/>
+            <wp:docPr id="1946724841" name="Picture 1"/>
             <wp:cNvGraphicFramePr>
               <a:graphicFrameLocks xmlns:a="http://schemas.openxmlformats.org/drawingml/2006/main" noChangeAspect="1"/>
             </wp:cNvGraphicFramePr>
@@ -128,7 +128,7 @@
               <a:graphicData uri="http://schemas.openxmlformats.org/drawingml/2006/picture">
                 <pic:pic xmlns:pic="http://schemas.openxmlformats.org/drawingml/2006/picture">
                   <pic:nvPicPr>
-                    <pic:cNvPr id="1487472948" name=""/>
+                    <pic:cNvPr id="1946724841" name=""/>
                     <pic:cNvPicPr/>
                   </pic:nvPicPr>
                   <pic:blipFill>
@@ -140,7 +140,7 @@
                   <pic:spPr>
                     <a:xfrm>
                       <a:off x="0" y="0"/>
-                      <a:ext cx="3043068" cy="2753670"/>
+                      <a:ext cx="2973213" cy="2777832"/>
                     </a:xfrm>
                     <a:prstGeom prst="rect">
                       <a:avLst/>
@@ -161,7 +161,7 @@
     </w:p>
     <w:p>
       <w:r>
-        <w:t>722018</w:t>
+        <w:t>132981</w:t>
       </w:r>
       <w:r>
         <w:t xml:space="preserve"> </w:t>
@@ -170,13 +170,13 @@
         <w:t xml:space="preserve">cycles * </w:t>
       </w:r>
       <w:r>
-        <w:t>8.361</w:t>
-      </w:r>
-      <w:r>
-        <w:t xml:space="preserve"> post-imp. clock period = </w:t>
-      </w:r>
-      <w:r>
-        <w:t>6.0368</w:t>
+        <w:t xml:space="preserve">7.23 </w:t>
+      </w:r>
+      <w:r>
+        <w:t xml:space="preserve">post-imp. clock period = </w:t>
+      </w:r>
+      <w:r>
+        <w:t>0.96145</w:t>
       </w:r>
       <w:r>
         <w:t xml:space="preserve"> </w:t>
@@ -189,16 +189,16 @@
     </w:p>
     <w:p>
       <w:r>
-        <w:t>8.25</w:t>
-      </w:r>
-      <w:r>
-        <w:t xml:space="preserve"> </w:t>
+        <w:t xml:space="preserve">51.962 </w:t>
       </w:r>
       <w:r>
         <w:t xml:space="preserve">/ </w:t>
       </w:r>
       <w:r>
-        <w:t>6.0368</w:t>
+        <w:t>0.</w:t>
+      </w:r>
+      <w:r>
+        <w:t>96145</w:t>
       </w:r>
       <w:r>
         <w:t xml:space="preserve"> = </w:t>
@@ -207,13 +207,7 @@
         <w:rPr>
           <w:u w:val="single"/>
         </w:rPr>
-        <w:t>1.</w:t>
-      </w:r>
-      <w:r>
-        <w:rPr>
-          <w:u w:val="single"/>
-        </w:rPr>
-        <w:t>367</w:t>
+        <w:t>54.0453</w:t>
       </w:r>
       <w:r>
         <w:rPr>
@@ -844,7 +838,6 @@
   <w:style w:type="character" w:default="1" w:styleId="DefaultParagraphFont">
     <w:name w:val="Default Paragraph Font"/>
     <w:uiPriority w:val="1"/>
-    <w:semiHidden/>
     <w:unhideWhenUsed/>
   </w:style>
   <w:style w:type="table" w:default="1" w:styleId="TableNormal">

</xml_diff>